<commit_message>
Address EC-164 review comments on breadcrumb story
Resolve client (Kelly) comments: (1) add EDS-vs-Commerce classification note
(EDS block, ACCS data dependency); (2) align scope to include My Account/Order
Detail/Search and fix Design Specs vs Context Behavior inconsistency; (3) fix
mobile format to 'Home > ... > Parent > Current' (parent stays clickable).
Adds paste-ready Jira reply.

Co-Authored-By: Claude Opus 4.6 (1M context) <noreply@anthropic.com>
</commit_message>
<xml_diff>
--- a/docs/SDD/Stories/Breadcrumb/EC-Breadcrumb-Story.docx
+++ b/docs/SDD/Stories/Breadcrumb/EC-Breadcrumb-Story.docx
@@ -93,6 +93,55 @@
       </w:r>
     </w:p>
     <w:p>
+      <w:r>
+        <w:rPr>
+          <w:b/>
+        </w:rPr>
+        <w:t>Classification:</w:t>
+      </w:r>
+      <w:r>
+        <w:t xml:space="preserve"> This is an </w:t>
+      </w:r>
+      <w:r>
+        <w:rPr>
+          <w:b/>
+        </w:rPr>
+        <w:t>EDS block</w:t>
+      </w:r>
+      <w:r>
+        <w:t xml:space="preserve"> rendered in the EDS page lifecycle (decorated by </w:t>
+      </w:r>
+      <w:r>
+        <w:rPr>
+          <w:rFonts w:ascii="Consolas" w:hAnsi="Consolas"/>
+          <w:color w:val="8B0000"/>
+          <w:sz w:val="18"/>
+        </w:rPr>
+        <w:t>scripts.js</w:t>
+      </w:r>
+      <w:r>
+        <w:t xml:space="preserve">, styled/marked-up in the EDS codebase, emitting SEO JSON-LD). Its </w:t>
+      </w:r>
+      <w:r>
+        <w:rPr>
+          <w:b/>
+        </w:rPr>
+        <w:t>content is Commerce-driven</w:t>
+      </w:r>
+      <w:r>
+        <w:t xml:space="preserve"> — the category path is sourced from the ACCS Catalog Service. "No authoring" is expected for a dynamic EDS block; the classification reflects *where/how it is built and shipped* (an EDS block), and the Commerce taxonomy is captured as a </w:t>
+      </w:r>
+      <w:r>
+        <w:rPr>
+          <w:b/>
+        </w:rPr>
+        <w:t>data dependency</w:t>
+      </w:r>
+      <w:r>
+        <w:t>, not a separate storefront-component ticket.</w:t>
+      </w:r>
+    </w:p>
+    <w:p>
       <w:pPr>
         <w:pStyle w:val="Heading2"/>
       </w:pPr>
@@ -179,7 +228,16 @@
         <w:pStyle w:val="ListBullet"/>
       </w:pPr>
       <w:r>
-        <w:t>Breadcrumb bar: full-width, ~38–40px tall, placed below the header and above the page content (appears on PLP, PDP, Cart, Checkout).</w:t>
+        <w:t xml:space="preserve">Breadcrumb bar: full-width, ~38–40px tall, placed below the header and above the page content. Appears on </w:t>
+      </w:r>
+      <w:r>
+        <w:rPr>
+          <w:b/>
+        </w:rPr>
+        <w:t>PLP, PDP, Cart, Checkout, Search results, My Account, and Order Detail</w:t>
+      </w:r>
+      <w:r>
+        <w:t xml:space="preserve"> (see Context Behavior).</w:t>
       </w:r>
     </w:p>
     <w:p>
@@ -307,18 +365,34 @@
         <w:pStyle w:val="ListBullet"/>
       </w:pPr>
       <w:r>
-        <w:t xml:space="preserve">Mobile: may truncate to </w:t>
+        <w:t xml:space="preserve">Mobile: collapse the </w:t>
       </w:r>
       <w:r>
         <w:rPr>
-          <w:rFonts w:ascii="Consolas" w:hAnsi="Consolas"/>
-          <w:color w:val="8B0000"/>
-          <w:sz w:val="18"/>
+          <w:b/>
         </w:rPr>
-        <w:t>Home &gt; … &gt; Current</w:t>
+        <w:t>middle</w:t>
       </w:r>
       <w:r>
-        <w:t xml:space="preserve"> (collapse middle crumbs) to fit 360px; tap targets ≥44×44px height-permitting (use adequate hit area).</w:t>
+        <w:t xml:space="preserve"> crumbs only and </w:t>
+      </w:r>
+      <w:r>
+        <w:rPr>
+          <w:b/>
+        </w:rPr>
+        <w:t>preserve the immediate parent</w:t>
+      </w:r>
+      <w:r>
+        <w:t xml:space="preserve"> so users can navigate back one level — format </w:t>
+      </w:r>
+      <w:r>
+        <w:rPr>
+          <w:b/>
+        </w:rPr>
+        <w:t>`Home &gt; … &gt; Parent &gt; Current`</w:t>
+      </w:r>
+      <w:r>
+        <w:t>. Home link + ellipsis (hidden middle levels) + clickable immediate parent + non-clickable current. Show the full trail when there are ≤3 levels; collapse the middle only at 4+ levels. Tap targets ≥44×44px (use adequate hit area).</w:t>
       </w:r>
     </w:p>
     <w:p>
@@ -337,13 +411,14 @@
         <w:tblLook w:firstColumn="1" w:firstRow="1" w:lastColumn="0" w:lastRow="0" w:noHBand="0" w:noVBand="1" w:val="04A0"/>
       </w:tblPr>
       <w:tblGrid>
-        <w:gridCol w:w="4320"/>
-        <w:gridCol w:w="4320"/>
+        <w:gridCol w:w="2880"/>
+        <w:gridCol w:w="2880"/>
+        <w:gridCol w:w="2880"/>
       </w:tblGrid>
       <w:tr>
         <w:tc>
           <w:tcPr>
-            <w:tcW w:type="dxa" w:w="4320"/>
+            <w:tcW w:type="dxa" w:w="2880"/>
             <w:shd w:fill="2C3E50" w:val="clear"/>
           </w:tcPr>
           <w:p>
@@ -366,7 +441,7 @@
         </w:tc>
         <w:tc>
           <w:tcPr>
-            <w:tcW w:type="dxa" w:w="4320"/>
+            <w:tcW w:type="dxa" w:w="2880"/>
             <w:shd w:fill="2C3E50" w:val="clear"/>
           </w:tcPr>
           <w:p>
@@ -387,11 +462,34 @@
             </w:r>
           </w:p>
         </w:tc>
+        <w:tc>
+          <w:tcPr>
+            <w:tcW w:type="dxa" w:w="2880"/>
+            <w:shd w:fill="2C3E50" w:val="clear"/>
+          </w:tcPr>
+          <w:p>
+            <w:r>
+              <w:rPr>
+                <w:b/>
+                <w:color w:val="FFFFFF"/>
+                <w:sz w:val="18"/>
+              </w:rPr>
+            </w:r>
+            <w:r>
+              <w:rPr>
+                <w:b/>
+                <w:color w:val="FFFFFF"/>
+                <w:sz w:val="18"/>
+              </w:rPr>
+              <w:t>Type</w:t>
+            </w:r>
+          </w:p>
+        </w:tc>
       </w:tr>
       <w:tr>
         <w:tc>
           <w:tcPr>
-            <w:tcW w:type="dxa" w:w="4320"/>
+            <w:tcW w:type="dxa" w:w="2880"/>
           </w:tcPr>
           <w:p>
             <w:r>
@@ -409,7 +507,7 @@
         </w:tc>
         <w:tc>
           <w:tcPr>
-            <w:tcW w:type="dxa" w:w="4320"/>
+            <w:tcW w:type="dxa" w:w="2880"/>
           </w:tcPr>
           <w:p>
             <w:r>
@@ -425,11 +523,29 @@
             </w:r>
           </w:p>
         </w:tc>
+        <w:tc>
+          <w:tcPr>
+            <w:tcW w:type="dxa" w:w="2880"/>
+          </w:tcPr>
+          <w:p>
+            <w:r>
+              <w:rPr>
+                <w:sz w:val="18"/>
+              </w:rPr>
+            </w:r>
+            <w:r>
+              <w:rPr>
+                <w:sz w:val="18"/>
+              </w:rPr>
+              <w:t>Commerce (ACCS taxonomy)</w:t>
+            </w:r>
+          </w:p>
+        </w:tc>
       </w:tr>
       <w:tr>
         <w:tc>
           <w:tcPr>
-            <w:tcW w:type="dxa" w:w="4320"/>
+            <w:tcW w:type="dxa" w:w="2880"/>
             <w:shd w:fill="F4F6F7" w:val="clear"/>
           </w:tcPr>
           <w:p>
@@ -448,7 +564,7 @@
         </w:tc>
         <w:tc>
           <w:tcPr>
-            <w:tcW w:type="dxa" w:w="4320"/>
+            <w:tcW w:type="dxa" w:w="2880"/>
             <w:shd w:fill="F4F6F7" w:val="clear"/>
           </w:tcPr>
           <w:p>
@@ -465,11 +581,30 @@
             </w:r>
           </w:p>
         </w:tc>
+        <w:tc>
+          <w:tcPr>
+            <w:tcW w:type="dxa" w:w="2880"/>
+            <w:shd w:fill="F4F6F7" w:val="clear"/>
+          </w:tcPr>
+          <w:p>
+            <w:r>
+              <w:rPr>
+                <w:sz w:val="18"/>
+              </w:rPr>
+            </w:r>
+            <w:r>
+              <w:rPr>
+                <w:sz w:val="18"/>
+              </w:rPr>
+              <w:t>Commerce (ACCS taxonomy)</w:t>
+            </w:r>
+          </w:p>
+        </w:tc>
       </w:tr>
       <w:tr>
         <w:tc>
           <w:tcPr>
-            <w:tcW w:type="dxa" w:w="4320"/>
+            <w:tcW w:type="dxa" w:w="2880"/>
           </w:tcPr>
           <w:p>
             <w:r>
@@ -487,7 +622,7 @@
         </w:tc>
         <w:tc>
           <w:tcPr>
-            <w:tcW w:type="dxa" w:w="4320"/>
+            <w:tcW w:type="dxa" w:w="2880"/>
           </w:tcPr>
           <w:p>
             <w:r>
@@ -503,11 +638,29 @@
             </w:r>
           </w:p>
         </w:tc>
+        <w:tc>
+          <w:tcPr>
+            <w:tcW w:type="dxa" w:w="2880"/>
+          </w:tcPr>
+          <w:p>
+            <w:r>
+              <w:rPr>
+                <w:sz w:val="18"/>
+              </w:rPr>
+            </w:r>
+            <w:r>
+              <w:rPr>
+                <w:sz w:val="18"/>
+              </w:rPr>
+              <w:t>Contextual</w:t>
+            </w:r>
+          </w:p>
+        </w:tc>
       </w:tr>
       <w:tr>
         <w:tc>
           <w:tcPr>
-            <w:tcW w:type="dxa" w:w="4320"/>
+            <w:tcW w:type="dxa" w:w="2880"/>
             <w:shd w:fill="F4F6F7" w:val="clear"/>
           </w:tcPr>
           <w:p>
@@ -526,7 +679,7 @@
         </w:tc>
         <w:tc>
           <w:tcPr>
-            <w:tcW w:type="dxa" w:w="4320"/>
+            <w:tcW w:type="dxa" w:w="2880"/>
             <w:shd w:fill="F4F6F7" w:val="clear"/>
           </w:tcPr>
           <w:p>
@@ -540,6 +693,140 @@
                 <w:sz w:val="18"/>
               </w:rPr>
               <w:t>Home &gt; Cart (and step labels where applicable)</w:t>
+            </w:r>
+          </w:p>
+        </w:tc>
+        <w:tc>
+          <w:tcPr>
+            <w:tcW w:type="dxa" w:w="2880"/>
+            <w:shd w:fill="F4F6F7" w:val="clear"/>
+          </w:tcPr>
+          <w:p>
+            <w:r>
+              <w:rPr>
+                <w:sz w:val="18"/>
+              </w:rPr>
+            </w:r>
+            <w:r>
+              <w:rPr>
+                <w:sz w:val="18"/>
+              </w:rPr>
+              <w:t>Contextual</w:t>
+            </w:r>
+          </w:p>
+        </w:tc>
+      </w:tr>
+      <w:tr>
+        <w:tc>
+          <w:tcPr>
+            <w:tcW w:type="dxa" w:w="2880"/>
+          </w:tcPr>
+          <w:p>
+            <w:r>
+              <w:rPr>
+                <w:sz w:val="18"/>
+              </w:rPr>
+            </w:r>
+            <w:r>
+              <w:rPr>
+                <w:sz w:val="18"/>
+              </w:rPr>
+              <w:t>My Account</w:t>
+            </w:r>
+          </w:p>
+        </w:tc>
+        <w:tc>
+          <w:tcPr>
+            <w:tcW w:type="dxa" w:w="2880"/>
+          </w:tcPr>
+          <w:p>
+            <w:r>
+              <w:rPr>
+                <w:sz w:val="18"/>
+              </w:rPr>
+            </w:r>
+            <w:r>
+              <w:rPr>
+                <w:sz w:val="18"/>
+              </w:rPr>
+              <w:t>Home &gt; My Account</w:t>
+            </w:r>
+          </w:p>
+        </w:tc>
+        <w:tc>
+          <w:tcPr>
+            <w:tcW w:type="dxa" w:w="2880"/>
+          </w:tcPr>
+          <w:p>
+            <w:r>
+              <w:rPr>
+                <w:sz w:val="18"/>
+              </w:rPr>
+            </w:r>
+            <w:r>
+              <w:rPr>
+                <w:sz w:val="18"/>
+              </w:rPr>
+              <w:t>Static/contextual</w:t>
+            </w:r>
+          </w:p>
+        </w:tc>
+      </w:tr>
+      <w:tr>
+        <w:tc>
+          <w:tcPr>
+            <w:tcW w:type="dxa" w:w="2880"/>
+            <w:shd w:fill="F4F6F7" w:val="clear"/>
+          </w:tcPr>
+          <w:p>
+            <w:r>
+              <w:rPr>
+                <w:sz w:val="18"/>
+              </w:rPr>
+            </w:r>
+            <w:r>
+              <w:rPr>
+                <w:sz w:val="18"/>
+              </w:rPr>
+              <w:t>Order Detail</w:t>
+            </w:r>
+          </w:p>
+        </w:tc>
+        <w:tc>
+          <w:tcPr>
+            <w:tcW w:type="dxa" w:w="2880"/>
+            <w:shd w:fill="F4F6F7" w:val="clear"/>
+          </w:tcPr>
+          <w:p>
+            <w:r>
+              <w:rPr>
+                <w:sz w:val="18"/>
+              </w:rPr>
+            </w:r>
+            <w:r>
+              <w:rPr>
+                <w:sz w:val="18"/>
+              </w:rPr>
+              <w:t>Home &gt; My Account &gt; Order History &gt; Order Detail</w:t>
+            </w:r>
+          </w:p>
+        </w:tc>
+        <w:tc>
+          <w:tcPr>
+            <w:tcW w:type="dxa" w:w="2880"/>
+            <w:shd w:fill="F4F6F7" w:val="clear"/>
+          </w:tcPr>
+          <w:p>
+            <w:r>
+              <w:rPr>
+                <w:sz w:val="18"/>
+              </w:rPr>
+            </w:r>
+            <w:r>
+              <w:rPr>
+                <w:sz w:val="18"/>
+              </w:rPr>
+              <w:t>Static/contextual</w:t>
             </w:r>
           </w:p>
         </w:tc>
@@ -560,6 +847,52 @@
       </w:pPr>
       <w:r>
         <w:t>On PLP, the last crumb is the current category (non-link).</w:t>
+      </w:r>
+    </w:p>
+    <w:p>
+      <w:pPr>
+        <w:pStyle w:val="ListBullet"/>
+      </w:pPr>
+      <w:r>
+        <w:rPr>
+          <w:b/>
+        </w:rPr>
+        <w:t>Commerce pages</w:t>
+      </w:r>
+      <w:r>
+        <w:t xml:space="preserve"> derive the trail from the ACCS category taxonomy; </w:t>
+      </w:r>
+      <w:r>
+        <w:rPr>
+          <w:b/>
+        </w:rPr>
+        <w:t>account pages</w:t>
+      </w:r>
+      <w:r>
+        <w:t xml:space="preserve"> use a static/contextual trail (not catalog-driven).</w:t>
+      </w:r>
+    </w:p>
+    <w:p>
+      <w:pPr>
+        <w:pStyle w:val="ListBullet"/>
+      </w:pPr>
+      <w:r>
+        <w:rPr>
+          <w:b/>
+        </w:rPr>
+        <w:t>Scope note:</w:t>
+      </w:r>
+      <w:r>
+        <w:t xml:space="preserve"> the breadcrumb behavior on account pages (My Account, Order Detail) is covered here, but the </w:t>
+      </w:r>
+      <w:r>
+        <w:rPr>
+          <w:b/>
+        </w:rPr>
+        <w:t>account pages themselves are not yet in the B2C Figma canvas / block inventory</w:t>
+      </w:r>
+      <w:r>
+        <w:t xml:space="preserve"> — they require their own design/build tickets. This ticket covers the breadcrumb; account-page delivery is a dependency.</w:t>
       </w:r>
     </w:p>
     <w:p>
@@ -678,7 +1011,7 @@
         <w:pStyle w:val="ListBullet"/>
       </w:pPr>
       <w:r>
-        <w:t>Breadcrumb appears on PLP, PDP, Cart, and Checkout below the header.</w:t>
+        <w:t>Breadcrumb appears on PLP, PDP, Cart, Checkout, Search results, My Account, and Order Detail below the header.</w:t>
       </w:r>
     </w:p>
     <w:p>
@@ -686,7 +1019,7 @@
         <w:pStyle w:val="ListBullet"/>
       </w:pPr>
       <w:r>
-        <w:t>Trail accurately reflects the current location: Home &gt; category path &gt; (product name on PDP).</w:t>
+        <w:t>Trail accurately reflects the current location: Home &gt; category path &gt; (product name on PDP); account pages show their static trail.</w:t>
       </w:r>
     </w:p>
     <w:p>
@@ -694,7 +1027,7 @@
         <w:pStyle w:val="ListBullet"/>
       </w:pPr>
       <w:r>
-        <w:t>All crumbs except the last are links and navigate to the correct category/home; the last crumb is current (non-link).</w:t>
+        <w:t>All crumbs except the last are links and navigate to the correct category/page/home; the last crumb is current (non-link).</w:t>
       </w:r>
     </w:p>
     <w:p>
@@ -710,7 +1043,27 @@
         <w:pStyle w:val="ListBullet"/>
       </w:pPr>
       <w:r>
-        <w:t>On mobile (360px), the trail fits — middle crumbs collapse (Home &gt; … &gt; Current) without breaking layout.</w:t>
+        <w:t xml:space="preserve">On mobile (360px), the trail collapses the middle crumbs only, keeping the </w:t>
+      </w:r>
+      <w:r>
+        <w:rPr>
+          <w:b/>
+        </w:rPr>
+        <w:t>immediate parent clickable</w:t>
+      </w:r>
+      <w:r>
+        <w:t xml:space="preserve"> — format </w:t>
+      </w:r>
+      <w:r>
+        <w:rPr>
+          <w:rFonts w:ascii="Consolas" w:hAnsi="Consolas"/>
+          <w:color w:val="8B0000"/>
+          <w:sz w:val="18"/>
+        </w:rPr>
+        <w:t>Home &gt; … &gt; Parent &gt; Current</w:t>
+      </w:r>
+      <w:r>
+        <w:t>. Full trail shown at ≤3 levels; middle collapsed at 4+ levels; no layout break.</w:t>
       </w:r>
     </w:p>
     <w:p>
@@ -897,15 +1250,18 @@
         <w:pStyle w:val="ListBullet"/>
       </w:pPr>
       <w:r>
-        <w:t>Confirm mobile truncation rule (collapse middle vs. horizontal scroll).</w:t>
+        <w:t>Confirm the ellipsis (</w:t>
       </w:r>
-    </w:p>
-    <w:p>
-      <w:pPr>
-        <w:pStyle w:val="ListBullet"/>
-      </w:pPr>
       <w:r>
-        <w:t>Confirm breadcrumb presence on Cart/Checkout (Figma shows it; verify it's desired there).</w:t>
+        <w:rPr>
+          <w:rFonts w:ascii="Consolas" w:hAnsi="Consolas"/>
+          <w:color w:val="8B0000"/>
+          <w:sz w:val="18"/>
+        </w:rPr>
+        <w:t>…</w:t>
+      </w:r>
+      <w:r>
+        <w:t>) behavior on mobile: expandable control vs. non-interactive indicator of hidden levels.</w:t>
       </w:r>
     </w:p>
     <w:p>
@@ -914,6 +1270,81 @@
       </w:pPr>
       <w:r>
         <w:t>Confirm separator style (chevron vs. line vs. slash) for final design.</w:t>
+      </w:r>
+    </w:p>
+    <w:p>
+      <w:pPr>
+        <w:pStyle w:val="ListBullet"/>
+      </w:pPr>
+      <w:r>
+        <w:rPr>
+          <w:b/>
+        </w:rPr>
+        <w:t>Dependency:</w:t>
+      </w:r>
+      <w:r>
+        <w:t xml:space="preserve"> account pages (My Account, Order Detail) require their own design/build tickets; this ticket covers breadcrumb behavior on them.</w:t>
+      </w:r>
+    </w:p>
+    <w:p>
+      <w:pPr>
+        <w:pStyle w:val="Heading2"/>
+      </w:pPr>
+      <w:r>
+        <w:t>Resolved (per EC-164 review, Jul 2026)</w:t>
+      </w:r>
+    </w:p>
+    <w:p>
+      <w:pPr>
+        <w:pStyle w:val="ListBullet"/>
+      </w:pPr>
+      <w:r>
+        <w:rPr>
+          <w:b/>
+        </w:rPr>
+        <w:t>Classification:</w:t>
+      </w:r>
+      <w:r>
+        <w:t xml:space="preserve"> stays an EDS ticket — EDS block with Commerce (ACCS) data dependency (no separate storefront-component ticket).</w:t>
+      </w:r>
+    </w:p>
+    <w:p>
+      <w:pPr>
+        <w:pStyle w:val="ListBullet"/>
+      </w:pPr>
+      <w:r>
+        <w:rPr>
+          <w:b/>
+        </w:rPr>
+        <w:t>Scope:</w:t>
+      </w:r>
+      <w:r>
+        <w:t xml:space="preserve"> includes My Account and Order Detail (aligned Design Specs with the Context Behavior table); account trails are static/contextual.</w:t>
+      </w:r>
+    </w:p>
+    <w:p>
+      <w:pPr>
+        <w:pStyle w:val="ListBullet"/>
+      </w:pPr>
+      <w:r>
+        <w:rPr>
+          <w:b/>
+        </w:rPr>
+        <w:t>Mobile format:</w:t>
+      </w:r>
+      <w:r>
+        <w:t xml:space="preserve"> </w:t>
+      </w:r>
+      <w:r>
+        <w:rPr>
+          <w:rFonts w:ascii="Consolas" w:hAnsi="Consolas"/>
+          <w:color w:val="8B0000"/>
+          <w:sz w:val="18"/>
+        </w:rPr>
+        <w:t>Home &gt; … &gt; Parent &gt; Current</w:t>
+      </w:r>
+      <w:r>
+        <w:t xml:space="preserve"> — immediate parent stays clickable; collapse middle only at 4+ levels.</w:t>
       </w:r>
     </w:p>
     <w:sectPr>

</xml_diff>